<commit_message>
Enhance Chapter 05 opening with high-stakes moral evaluation and risk analysis
</commit_message>
<xml_diff>
--- a/manuscript/chapter-05-the-altered-record.docx
+++ b/manuscript/chapter-05-the-altered-record.docx
@@ -8,6 +8,31 @@
       </w:pPr>
       <w:r>
         <w:t>Chapter 5: The Altered Record</w:t>
+      </w:r>
+    </w:p>
+    <w:p>
+      <w:r>
+        <w:t>Elara stood before her console, watching the executive escalation order seal itself into Trinity’s central ledger. In Drona, every crisis was an equation waiting for an operator to balance it, but as she evaluated her remaining options, she knew the math offered no safe resolution.</w:t>
+      </w:r>
+    </w:p>
+    <w:p>
+      <w:r>
+        <w:t>Compliance was the path of least resistance. If she did nothing, her profile remained untarnished, her clearance intact, and her standing in Drona secure. The system would process Gage, Ben, and Otto through standard culling protocols—separating their quarters, fragmenting their assignments, and ensuring they broke individually before they could threaten the city’s design. To remain passive was to survive, but it meant becoming an accomplice to the very machinery that had erased Teresa.</w:t>
+      </w:r>
+    </w:p>
+    <w:p>
+      <w:r>
+        <w:t>An official administrative appeal was equally futile. She could lodge a formal dissent through Drona’s governance channels, but bureaucracy in Trinity was designed to exhaust resistance through delay. By the time her petition reached a review board, the boys’ separation directives would already be enforced, and her name would simply be flagged for secondary audit.</w:t>
+      </w:r>
+    </w:p>
+    <w:p>
+      <w:r>
+        <w:t>That left only a third option: direct, unauthorized intervention.</w:t>
+      </w:r>
+    </w:p>
+    <w:p>
+      <w:r>
+        <w:t>Altering a protected governance document inside the restricted archives was an act of high treason. The stakes were absolute. If she failed—or if the system traced the biometric footprint of her override—there would be no second chance. She would lose her clearance, her freedom, and her place in Trinity, facing permanent containment or exile to the ground she had once tried so desperately to reach. But as she watched the three linked signals pulsing on her screen, Elara knew that safety bought through inaction was no safety at all.</w:t>
       </w:r>
     </w:p>
     <w:p>

</xml_diff>

<commit_message>
Refine Chapter 05 opening to reflect Elara's existing UNDER REVIEW status and cornered position
</commit_message>
<xml_diff>
--- a/manuscript/chapter-05-the-altered-record.docx
+++ b/manuscript/chapter-05-the-altered-record.docx
@@ -17,7 +17,7 @@
     </w:p>
     <w:p>
       <w:r>
-        <w:t>Compliance was the path of least resistance. If she did nothing, her profile remained untarnished, her clearance intact, and her standing in Drona secure. The system would process Gage, Ben, and Otto through standard culling protocols—separating their quarters, fragmenting their assignments, and ensuring they broke individually before they could threaten the city’s design. To remain passive was to survive, but it meant becoming an accomplice to the very machinery that had erased Teresa.</w:t>
+        <w:t>Compliance was the quiet, cautious choice. Her operator status was already flagged as UNDER REVIEW on the monitoring board—she was already backed into a corner, her every input scrutinized by Drona evaluators and her peers. If she did nothing, she wouldn't clear her profile, but she wouldn't push her precarious position over a cliff. She could absorb the administrative reprimand, let the system process Gage, Ben, and Otto through standard culling protocols, and keep what remained of her career intact. To remain passive was to protect herself in a corner, but it meant becoming an accomplice to the very machinery that had erased Teresa.</w:t>
       </w:r>
     </w:p>
     <w:p>
@@ -32,7 +32,7 @@
     </w:p>
     <w:p>
       <w:r>
-        <w:t>Altering a protected governance document inside the restricted archives was an act of high treason. The stakes were absolute. If she failed—or if the system traced the biometric footprint of her override—there would be no second chance. She would lose her clearance, her freedom, and her place in Trinity, facing permanent containment or exile to the ground she had once tried so desperately to reach. But as she watched the three linked signals pulsing on her screen, Elara knew that safety bought through inaction was no safety at all.</w:t>
+        <w:t>Altering a protected governance document inside the restricted archives was an act of high treason. The stakes were absolute. In her already compromised position, any further slip would escalate an administrative review into immediate, permanent catastrophe. If she failed—or if the system traced the biometric footprint of her override—there would be no second chance. She would lose her clearance, her freedom, and her place in Trinity, facing permanent containment or exile to the ground she had once tried so desperately to reach. But as she watched the three linked signals pulsing on her screen, Elara knew that safety bought through inaction was no safety at all.</w:t>
       </w:r>
     </w:p>
     <w:p>

</xml_diff>

<commit_message>
Smooth transitional flow in Chapter 05 opening between moral evaluation and high-treason choice
</commit_message>
<xml_diff>
--- a/manuscript/chapter-05-the-altered-record.docx
+++ b/manuscript/chapter-05-the-altered-record.docx
@@ -22,17 +22,17 @@
     </w:p>
     <w:p>
       <w:r>
-        <w:t>An official administrative appeal was equally futile. She could lodge a formal dissent through Drona’s governance channels, but bureaucracy in Trinity was designed to exhaust resistance through delay. By the time her petition reached a review board, the boys’ separation directives would already be enforced, and her name would simply be flagged for secondary audit.</w:t>
+        <w:t>An official administrative appeal offered no real alternative. She could lodge a formal dissent through Drona’s governance channels, but bureaucracy in Trinity was designed to exhaust resistance through delay. By the time her petition reached a review board, the boys’ separation directives would already be enforced, and her name would simply be flagged for secondary audit.</w:t>
       </w:r>
     </w:p>
     <w:p>
       <w:r>
-        <w:t>That left only a third option: direct, unauthorized intervention.</w:t>
+        <w:t>Yet sitting back while the system dismantled the boys was a line she refused to walk again. That left only a desperate third option: direct, unauthorized intervention.</w:t>
       </w:r>
     </w:p>
     <w:p>
       <w:r>
-        <w:t>Altering a protected governance document inside the restricted archives was an act of high treason. The stakes were absolute. In her already compromised position, any further slip would escalate an administrative review into immediate, permanent catastrophe. If she failed—or if the system traced the biometric footprint of her override—there would be no second chance. She would lose her clearance, her freedom, and her place in Trinity, facing permanent containment or exile to the ground she had once tried so desperately to reach. But as she watched the three linked signals pulsing on her screen, Elara knew that safety bought through inaction was no safety at all.</w:t>
+        <w:t>Altering a protected governance document inside the restricted archives was an act of high treason. In her already compromised position, any further slip would escalate an administrative review into immediate, permanent catastrophe. If she failed—or if the system traced the biometric footprint of her override—there would be no second chance. She would lose her clearance, her freedom, and her place in Trinity, facing permanent containment or exile to the ground she had once tried so desperately to reach. But as she watched the three linked signals pulsing on her screen, Elara knew that safety bought through inaction was no safety at all.</w:t>
       </w:r>
     </w:p>
     <w:p>

</xml_diff>

<commit_message>
Add cover strategy and peer reactions to Elara's departure in Chapter 05
</commit_message>
<xml_diff>
--- a/manuscript/chapter-05-the-altered-record.docx
+++ b/manuscript/chapter-05-the-altered-record.docx
@@ -37,7 +37,22 @@
     </w:p>
     <w:p>
       <w:r>
-        <w:t>She left her console and entered the nearest Skylark before the doors closed. The elevator began its descent toward the administrative tiers. Elara waited until the pod had gathered speed, then knelt beside the maintenance panel and used the metal tip of her hairpin to loosen the exhaust-vent screws.</w:t>
+        <w:t>She could not simply walk away from her console. In a room monitored by three rival ganas—and with her own operator status flagged as UNDER REVIEW—an unannounced departure during post-Initiation processing would trigger an immediate security alert. Every move had to be covered by procedural logic.</w:t>
+      </w:r>
+    </w:p>
+    <w:p>
+      <w:r>
+        <w:t>Elara initiated Drona’s mandatory post-shift audit protocol. She selected the option for physical ledger verification—a procedural requirement that allowed an operator facing administrative review twenty minutes to retrieve hard-copy archive documentation from the sub-tier vaults before executive lockouts took effect. On the room’s central display, her console status shifted from active monitoring to TEMPORARY TRANSIT: AUDIT RETRIEVAL.</w:t>
+      </w:r>
+    </w:p>
+    <w:p>
+      <w:r>
+        <w:t>Daren glanced up, a faint, smug smirk playing at the corner of his mouth; he assumed she was scurrying off to prepare her defense for the upcoming inquiry. Rowan watched her log the code without expression, satisfied that she was following protocol. Rohan merely nodded once, acknowledging her compliance with system procedures.</w:t>
+      </w:r>
+    </w:p>
+    <w:p>
+      <w:r>
+        <w:t>With her twenty-minute clock ticking on the main board, Elara stepped away from the console with deliberate, unhurried precision. She walked past the curved monitoring desks, her pulse held steady against the room's biometric sensors, and entered the nearest Skylark before the doors closed. The elevator began its descent toward the administrative tiers. Elara waited until the pod had gathered speed, then knelt beside the maintenance panel and used the metal tip of her hairpin to loosen the exhaust-vent screws.</w:t>
       </w:r>
     </w:p>
     <w:p>

</xml_diff>

<commit_message>
Refine physics and mechanical sequence for Elara's exit onto the shaft ladder in Chapter 05
</commit_message>
<xml_diff>
--- a/manuscript/chapter-05-the-altered-record.docx
+++ b/manuscript/chapter-05-the-altered-record.docx
@@ -57,12 +57,22 @@
     </w:p>
     <w:p>
       <w:r>
-        <w:t>The opening was barely wide enough for her hand. She reached through, found the service cables running along the elevator shaft, and pulled herself into the narrow maintenance channel above the moving pod.</w:t>
+        <w:t>Removing the vent grill exposed the secondary access latch designed for emergency shaft maintenance. Elara disengaged the ceiling locks, pushing the hinged hatch panel upward into the dark, vertical corridor. Using the interior handrails for leverage, she hoisted her torso into the howling wind above the car, pulling herself flat onto the vibrating roof.</w:t>
       </w:r>
     </w:p>
     <w:p>
       <w:r>
-        <w:t>The Skylark dropped away beneath her. The shaft wind tore at her uniform and filled her ears with the roar of the city moving through its own machinery. She gripped the cables and climbed, one hand above the other, while the elevator continued racing toward the ground floor.</w:t>
+        <w:t>The pod was dropping too fast to risk a direct leap to the wall; the downward velocity would tear her fingers from the rungs the moment she touched them. Crouching on the oil-slicked metal, she tracked the vertical steel guide-rail running beside the car. As the pod sped past a mid-shaft maintenance junction, the gap between the car roof and the wall ladder briefly compressed to a mere foot.</w:t>
+      </w:r>
+    </w:p>
+    <w:p>
+      <w:r>
+        <w:t>Elara timed her move to the split-second. She lunged for the ladder's vertical steel upright, wrapping her forearm around the bar and absorbing the violent downward jerk against the rung braces. The pod dropped away beneath her boots with a deafening rush of displacement wind, leaving her suspended in the dark shaft, knees locked against the wall, her knuckles white as she fought the momentum trying to throw her into the void.</w:t>
+      </w:r>
+    </w:p>
+    <w:p>
+      <w:r>
+        <w:t>The shaft wind tore at her uniform and filled her ears with the roar of the city moving through its own machinery. She gripped the cables and climbed, one hand above the other, while the elevator continued racing toward the ground floor.</w:t>
       </w:r>
     </w:p>
     <w:p>

</xml_diff>

<commit_message>
Refine Chapter 5 emergence contrast and Trinity outcome framing
</commit_message>
<xml_diff>
--- a/manuscript/chapter-05-the-altered-record.docx
+++ b/manuscript/chapter-05-the-altered-record.docx
@@ -23,6 +23,11 @@
     <w:p>
       <w:r>
         <w:t>An official administrative appeal offered no real alternative. She could lodge a formal dissent through Drona’s governance channels, but bureaucracy in Trinity was designed to exhaust resistance through delay. By the time her petition reached a review board, the boys’ separation directives would already be enforced, and her name would simply be flagged for secondary audit.</w:t>
+      </w:r>
+    </w:p>
+    <w:p>
+      <w:r>
+        <w:t>The three boys were not Teresa, and Elara knew better than to confuse one loss with another. But the pattern was unmistakable: the system had identified a form of survival it could not control and was preparing to destroy it rather than learn from it. She had watched Trinity do the same thing to Teresa’s life, reducing uncertainty to a limitation and limitation to an excuse. She could not prevent what had happened to Teresa. She could decide what happened next.</w:t>
       </w:r>
     </w:p>
     <w:p>
@@ -92,37 +97,22 @@
     </w:p>
     <w:p>
       <w:r>
-        <w:t>Elara used the terminal's emergency access sequence, entered the token request, and waited while the system compared her biometric identity against the superintendent's authorization. The first check failed. She tried again with the report reference number. The second check opened a narrow administrative channel.</w:t>
+        <w:t>Elara ran the terminal’s diagnostic routine, substituting the report reference for the supervisor’s key to clear the secondary verification gate. The administrative portal opened.</w:t>
       </w:r>
     </w:p>
     <w:p>
       <w:r>
-        <w:t>She did not copy the entire archive. She changed one record.</w:t>
+        <w:t>She located the cohort assignment file and made a single, precise edit:</w:t>
       </w:r>
     </w:p>
     <w:p>
       <w:r>
-        <w:t>GAGE. BEN. OTTO.</w:t>
+        <w:t>GAGE. BEN. OTTO. MINER TOWN SECTOR ONE INDUCTION: STANDARD COHORT. DEVIATION ESCALATION: WITHHELD PENDING EXECUTIVE REVIEW.</w:t>
       </w:r>
     </w:p>
     <w:p>
       <w:r>
-        <w:t>MINER TOWN SECTOR ONE INDUCTION: STANDARD COHORT.</w:t>
-      </w:r>
-    </w:p>
-    <w:p>
-      <w:r>
-        <w:t>DEVIATION ESCALATION: WITHHELD PENDING EXECUTIVE REVIEW.</w:t>
-      </w:r>
-    </w:p>
-    <w:p>
-      <w:r>
-        <w:t>The system warned her that withholding the Sector One escalation details constituted falsification of a protected governance document. Elara looked at the countdown in the corner of the screen. She thought of Teresa waiting for a cure that had never come. She thought of the ground settlements and the people Trinity had reduced to acceptable losses.</w:t>
-      </w:r>
-    </w:p>
-    <w:p>
-      <w:r>
-        <w:t>Then she confirmed the alteration.</w:t>
+        <w:t>The screen flashed a standard governance warning regarding record tampering. Elara bypassed the prompt, hit confirm, and watched the status shift to saved.</w:t>
       </w:r>
     </w:p>
     <w:p>
@@ -178,6 +168,161 @@
     <w:p>
       <w:r>
         <w:t>For once, she did not reduce them to separate entries. She left the connection visible and allowed the system to record what it could not yet explain.</w:t>
+      </w:r>
+    </w:p>
+    <w:p>
+      <w:r>
+        <w:t>The central grid went dark. For a moment, the room held only the faint mechanical hum of the monitoring floor.</w:t>
+      </w:r>
+    </w:p>
+    <w:p>
+      <w:r>
+        <w:t>SHIFT LOCK COMPLETE. MANUAL OBSERVATION RELEASED. CONTINUOUS MONITORING DURATION: TWENTY-FOUR HOURS.</w:t>
+      </w:r>
+    </w:p>
+    <w:p>
+      <w:r>
+        <w:t>The four representatives fell back into their chairs almost at once. No one spoke. Their bodies had been held upright by procedure, caffeine, and the expectation that another alert would demand their attention. With the lock released, their shoulders dropped and their hands went slack beside the consoles.</w:t>
+      </w:r>
+    </w:p>
+    <w:p>
+      <w:r>
+        <w:t>Elara blinked against the room's ordinary light. The displays had kept her pupils narrowed for so long that the surrounding walls appeared washed out, then briefly doubled at the edges. Rowan pressed his fingertips against his eyelids. Daren leaned forward with both palms on his knees, waiting for the floor to stop moving. Rohan turned his head slowly, allowing his eyes to adjust from the bright feeds to the dim recovery station beyond them.</w:t>
+      </w:r>
+    </w:p>
+    <w:p>
+      <w:r>
+        <w:t>For twenty-four hours, Trinity had treated their attention as another resource to be spent. Now the system released them with the same indifference with which it had held them. The screens went dark, but the afterimage of the boys' three linked signals remained behind Elara's eyes.</w:t>
+      </w:r>
+    </w:p>
+    <w:p>
+      <w:r>
+        <w:t>Daren looked at her across the darkened consoles. "We all know what happened in this room today," he said. His voice was rough from disuse, but the anger beneath it was clear. "And it was not what was supposed to happen."</w:t>
+      </w:r>
+    </w:p>
+    <w:p>
+      <w:r>
+        <w:t>Elara said nothing. Daren's accusation had found its mark, but the exhaustion behind her eyes gave him nothing to use. She let the silence remain between them while she decided which part of his charge he understood and which part he had invented.</w:t>
+      </w:r>
+    </w:p>
+    <w:p>
+      <w:r>
+        <w:t>"You meddled with the process," Daren continued. "You fed the system interpretations it had already rejected and called them observations. You pushed those candidates into a pattern they were never meant to occupy, and you did it for a reason I cannot name yet." He pushed himself upright, the chair rolling back behind him. "Being the lead does not give you the right to rewrite the work. It does not give you the right to decide which rules apply to you."</w:t>
+      </w:r>
+    </w:p>
+    <w:p>
+      <w:r>
+        <w:t>The words gathered speed as he crossed the space between them. By the time he stopped, he was close enough that his breath struck Elara's face. He spat the last accusation at her, each word sharpened by exhaustion and rage. "You made the system lie for you."</w:t>
+      </w:r>
+    </w:p>
+    <w:p>
+      <w:r>
+        <w:t>Rohan moved before Elara could respond. He stepped between them and placed one hand against Daren's chest, not striking him, only stopping his forward motion. The gesture was precise and final.</w:t>
+      </w:r>
+    </w:p>
+    <w:p>
+      <w:r>
+        <w:t>"Step back," Rohan said.</w:t>
+      </w:r>
+    </w:p>
+    <w:p>
+      <w:r>
+        <w:t>Daren's eyes dropped to the hand, then lifted to Rohan's face. "This is not your station."</w:t>
+      </w:r>
+    </w:p>
+    <w:p>
+      <w:r>
+        <w:t>"It is now," Rohan said. "You are no longer disputing a report. You are approaching an operator under review while your judgment is compromised. Take one step back, or I open the force ladder and record the reason myself."</w:t>
+      </w:r>
+    </w:p>
+    <w:p>
+      <w:r>
+        <w:t>For a moment, Daren looked ready to challenge him. Rohan's hand remained near the force-ladder controls, and the console displayed the first-stage intervention warning. Daren saw the escalation record forming before Rohan entered it and stepped away. Rohan lowered his hand but did not return to CORRECTION.</w:t>
+      </w:r>
+    </w:p>
+    <w:p>
+      <w:r>
+        <w:t>The four representatives gathered what remained of their composure and began making their way toward their quarters. Daren left first, still carrying his anger like a report he intended to file. Rowan followed without comment, his face unreadable in the blue light.</w:t>
+      </w:r>
+    </w:p>
+    <w:p>
+      <w:r>
+        <w:t>Rohan paused in front of Elara. "Whatever happens next, I will stand with you," he said.</w:t>
+      </w:r>
+    </w:p>
+    <w:p>
+      <w:r>
+        <w:t>Before Elara could understand what he meant, or what the promise might cost him, Rohan turned and walked away. For the first time, the constant blue light caught the scar along his face. It did not look like a scar then. It glinted like blue steel, less a mark of injury than a piece of armor he had carried so long it had become part of him.</w:t>
+      </w:r>
+    </w:p>
+    <w:p>
+      <w:r>
+        <w:t>Elara waited until Rohan disappeared beyond the recovery corridor before she moved. The walk to her quarters was only a few dozen steps, but each one seemed to open another question beneath her feet. The warning on her operator status. Daren's accusation. Rohan's promise. The altered record waiting inside the system like a second heartbeat.</w:t>
+      </w:r>
+    </w:p>
+    <w:p>
+      <w:r>
+        <w:t>Had she protected the boys, or only postponed the moment when Trinity would reach them? Would Rohan stand with her when the inquiry began, or had his promise been nothing more than exhaustion speaking through a moment of sympathy? What would the archive find when it reconstructed her movements? What would Daren report? What would she lose first: her clearance, her position, or the last part of herself that still believed she could change the system without becoming one of its offenders?</w:t>
+      </w:r>
+    </w:p>
+    <w:p>
+      <w:r>
+        <w:t>She walked beneath the blue corridor lights with her hands empty and her mind crowded by alarms. Behind her, the monitoring room continued recording the three linked signals. Ahead, her quarters waited with their sealed door and its small, indifferent reader. The system had returned her body to her. It had not returned her certainty.</w:t>
+      </w:r>
+    </w:p>
+    <w:p>
+      <w:r>
+        <w:t>Far below, the mine gates stood open beneath the first grey light of the next cycle.</w:t>
+      </w:r>
+    </w:p>
+    <w:p>
+      <w:r>
+        <w:t>Gage walked out of the dark with a steady gait. The guards' scanners registered the changes they could measure: altered posture, a controlled pulse, and a six-foot-five frame carrying Otto across his shoulders while dragging a semi-conscious Ben by the collar of his shirt. He was not the broken marionette they expected. He was the Engine that refused to red-line.</w:t>
+      </w:r>
+    </w:p>
+    <w:p>
+      <w:r>
+        <w:t>They moved slowly, but they moved together.</w:t>
+      </w:r>
+    </w:p>
+    <w:p>
+      <w:r>
+        <w:t>No monitor announced their survival. No report translated the shape they made between them. Gage believed they had beaten the chamber through force and endurance. Ben believed they had kept the part of one another that Trinity wanted to remove. Otto said nothing, his face turned toward the open gates and the pale strip of sky beyond them.</w:t>
+      </w:r>
+    </w:p>
+    <w:p>
+      <w:r>
+        <w:t>None of them was wrong. They had fought for every breath, resisted the chamber's chemistry, stopped one another from breaking, and walked out under their own power. Their survival belonged to them. Trinity had always intended for candidates to emerge from the Initiation; what it had not intended was for three of them to emerge together, still loyal to one another and capable of resisting the system's interpretation. The threat was not that they had survived. It was that they had survived without becoming separate, obedient workers.</w:t>
+      </w:r>
+    </w:p>
+    <w:p>
+      <w:r>
+        <w:t>What they did not know was that even this outcome had nearly been taken from them. Without Elara, the system would have separated them before the gates reopened, classified their mutual protection as a threat, and sent the force ladder to finish what the chamber had started. Their victory was real because they had earned it. Elara's intervention ensured Trinity could not redefine it before they reached the gates.</w:t>
+      </w:r>
+    </w:p>
+    <w:p>
+      <w:r>
+        <w:t>While they had been fighting in the dark, Elara had kept the separation order from becoming an extraction. She had preserved their cohesion in the report, challenged the system's interpretation, endured Daren's sabotage and accusation, and risked her clearance to alter the induction record before the executive review could turn their survival into three separate punishments. She had not won the Initiation for them. She had made it possible for their own victory to remain theirs.</w:t>
+      </w:r>
+    </w:p>
+    <w:p>
+      <w:r>
+        <w:t>They did not know that she had left their connection visible when the system demanded three separate entries. They walked toward the mine gates carrying the bright, private certainty of a victory they believed was entirely their own, and they were right to carry it. Elara had not taken that victory from them. She had paid the hidden cost of keeping it intact.</w:t>
+      </w:r>
+    </w:p>
+    <w:p>
+      <w:r>
+        <w:t>Elara reached her quarters at the same moment. Her hand closed around the door handle, but she did not turn it. In the polished metal, her reflection appeared in fragments: one eye, the edge of her mouth, the blue light cutting her face into planes that did not quite belong to her.</w:t>
+      </w:r>
+    </w:p>
+    <w:p>
+      <w:r>
+        <w:t>Below, three boys stepped out of the mine and into the beginning of whatever came after survival. Above, the woman who had kept them together stood alone before a locked door, listening to the system decide what her intervention would cost.</w:t>
+      </w:r>
+    </w:p>
+    <w:p>
+      <w:r>
+        <w:t>The saved carried the wounds they could see. The one who saved them would carry the scars no one else would ever be able to name.</w:t>
       </w:r>
     </w:p>
     <w:sectPr>

</xml_diff>